<commit_message>
updated claude and build order to explain the icons plan for excercise picker in future
</commit_message>
<xml_diff>
--- a/docs/Heft_Build_Order_Guide.docx
+++ b/docs/Heft_Build_Order_Guide.docx
@@ -1115,6 +1115,29 @@
           <w:sz w:val="22"/>
           <w:szCs w:val="22"/>
         </w:rPr>
+        <w:t xml:space="preserve">Equipment type icon assets: add 6 custom SVG icons as PDF assets to Assets.xcassets — icon-barbell, icon-dumbbell, icon-cable, icon-machine, icon-bodyweight, icon-band. Export as "Single Scale" PDF (vector, renders at any size). Simple line-art style, 28×28pt. These are the only custom icon assets in the project. Reference via Image("icon-barbell") etc.</w:t>
+      </w:r>
+    </w:p>
+    <w:p>
+      <w:pPr>
+        <w:pStyle w:val="ListParagraph"/>
+        <w:numPr>
+          <w:ilvl w:val="0"/>
+          <w:numId w:val="2"/>
+        </w:numPr>
+        <w:spacing w:before="40" w:after="40"/>
+      </w:pPr>
+      <w:r>
+        <w:rPr>
+          <w:rFonts w:ascii="Arial" w:cs="Arial" w:eastAsia="Arial" w:hAnsi="Arial"/>
+          <w:b w:val="false"/>
+          <w:bCs w:val="false"/>
+          <w:i w:val="false"/>
+          <w:iCs w:val="false"/>
+          <w:color w:val="111827"/>
+          <w:sz w:val="22"/>
+          <w:szCs w:val="22"/>
+        </w:rPr>
         <w:t xml:space="preserve">No raw hex strings or hardcoded numeric sizes appear anywhere in Swift source files outside Color+Tokens.swift and DesignTokens.swift.</w:t>
       </w:r>
     </w:p>
@@ -3381,30 +3404,30 @@
           <w:sz w:val="22"/>
           <w:szCs w:val="22"/>
         </w:rPr>
-        <w:t xml:space="preserve">Section 1 — Recents grid: 8 exercises in a 4×2 grid of large tappable tiles, sorted by frecency (combined recency + frequency score). Tile shows exercise name and muscle group icon. Haptic on tap.</w:t>
-      </w:r>
-    </w:p>
-    <w:p>
-      <w:pPr>
-        <w:pStyle w:val="ListParagraph"/>
-        <w:numPr>
-          <w:ilvl w:val="0"/>
-          <w:numId w:val="2"/>
-        </w:numPr>
-        <w:spacing w:before="40" w:after="40"/>
-      </w:pPr>
-      <w:r>
-        <w:rPr>
-          <w:rFonts w:ascii="Arial" w:cs="Arial" w:eastAsia="Arial" w:hAnsi="Arial"/>
-          <w:b w:val="false"/>
-          <w:bCs w:val="false"/>
-          <w:i w:val="false"/>
-          <w:iCs w:val="false"/>
-          <w:color w:val="111827"/>
-          <w:sz w:val="22"/>
-          <w:szCs w:val="22"/>
-        </w:rPr>
-        <w:t xml:space="preserve">Section 2 — Muscle group chips: single horizontal scroll row. Chips: Chest, Back, Shoulders, Arms, Legs, Core, Cardio. Tap to filter the list below.</w:t>
+        <w:t xml:space="preserve">Section 1 — Recents grid: 8 exercises in a 4×2 grid of large tappable tiles, sorted by frecency (combined recency + frequency score). Tile shows exercise name only — no icon on the tile. Haptic on tap.</w:t>
+      </w:r>
+    </w:p>
+    <w:p>
+      <w:pPr>
+        <w:pStyle w:val="ListParagraph"/>
+        <w:numPr>
+          <w:ilvl w:val="0"/>
+          <w:numId w:val="2"/>
+        </w:numPr>
+        <w:spacing w:before="40" w:after="40"/>
+      </w:pPr>
+      <w:r>
+        <w:rPr>
+          <w:rFonts w:ascii="Arial" w:cs="Arial" w:eastAsia="Arial" w:hAnsi="Arial"/>
+          <w:b w:val="false"/>
+          <w:bCs w:val="false"/>
+          <w:i w:val="false"/>
+          <w:iCs w:val="false"/>
+          <w:color w:val="111827"/>
+          <w:sz w:val="22"/>
+          <w:szCs w:val="22"/>
+        </w:rPr>
+        <w:t xml:space="preserve">Section 2 — Muscle group chips: single horizontal scroll row. Text-only chips — no icon. Labels: Chest, Back, Shoulders, Arms, Legs, Core, Cardio. Tap to filter the list below.</w:t>
       </w:r>
     </w:p>
     <w:p>
@@ -3473,7 +3496,7 @@
           <w:sz w:val="22"/>
           <w:szCs w:val="22"/>
         </w:rPr>
-        <w:t xml:space="preserve">Visual differentiation by equipment type: barbell, dumbbell, cable, machine, bodyweight — each with a distinct icon.</w:t>
+        <w:t xml:space="preserve">Visual differentiation by equipment type: each exercise row shows a small icon from the custom PDF asset set (icon-barbell, icon-dumbbell, icon-cable, icon-machine, icon-bodyweight, icon-band — see §2). 20pt, tinted with textMuted. Do not use SF Symbols for equipment icons — the custom set covers all categories SF Symbols does not.</w:t>
       </w:r>
     </w:p>
     <w:p>

</xml_diff>